<commit_message>
Add Classes to Data folder
</commit_message>
<xml_diff>
--- a/Classdocumentation.docx
+++ b/Classdocumentation.docx
@@ -1471,9 +1471,6 @@
             </w:r>
             <w:r>
               <w:t>ool</w:t>
-            </w:r>
-            <w:r>
-              <w:t>ean</w:t>
             </w:r>
           </w:p>
         </w:tc>
@@ -3429,6 +3426,15 @@
 </file>
 
 <file path=customXml/item1.xml><?xml version="1.0" encoding="utf-8"?>
+<?mso-contentType ?>
+<FormTemplates xmlns="http://schemas.microsoft.com/sharepoint/v3/contenttype/forms">
+  <Display>DocumentLibraryForm</Display>
+  <Edit>DocumentLibraryForm</Edit>
+  <New>DocumentLibraryForm</New>
+</FormTemplates>
+</file>
+
+<file path=customXml/item2.xml><?xml version="1.0" encoding="utf-8"?>
 <ct:contentTypeSchema xmlns:ct="http://schemas.microsoft.com/office/2006/metadata/contentType" xmlns:ma="http://schemas.microsoft.com/office/2006/metadata/properties/metaAttributes" ct:_="" ma:_="" ma:contentTypeName="Document" ma:contentTypeID="0x01010080D65B5BB2762F4381CE669903EF68C2" ma:contentTypeVersion="7" ma:contentTypeDescription="Create a new document." ma:contentTypeScope="" ma:versionID="cc95eeb450d2ddde299478338b125d76">
   <xsd:schema xmlns:xsd="http://www.w3.org/2001/XMLSchema" xmlns:xs="http://www.w3.org/2001/XMLSchema" xmlns:p="http://schemas.microsoft.com/office/2006/metadata/properties" xmlns:ns2="8bb89a28-ebc3-44d5-9fec-5843149b59d0" targetNamespace="http://schemas.microsoft.com/office/2006/metadata/properties" ma:root="true" ma:fieldsID="6c0a37faf2d23739459b97557a48c26e" ns2:_="">
     <xsd:import namespace="8bb89a28-ebc3-44d5-9fec-5843149b59d0"/>
@@ -3590,15 +3596,6 @@
 </ct:contentTypeSchema>
 </file>
 
-<file path=customXml/item2.xml><?xml version="1.0" encoding="utf-8"?>
-<?mso-contentType ?>
-<FormTemplates xmlns="http://schemas.microsoft.com/sharepoint/v3/contenttype/forms">
-  <Display>DocumentLibraryForm</Display>
-  <Edit>DocumentLibraryForm</Edit>
-  <New>DocumentLibraryForm</New>
-</FormTemplates>
-</file>
-
 <file path=customXml/item3.xml><?xml version="1.0" encoding="utf-8"?>
 <p:properties xmlns:p="http://schemas.microsoft.com/office/2006/metadata/properties" xmlns:xsi="http://www.w3.org/2001/XMLSchema-instance" xmlns:pc="http://schemas.microsoft.com/office/infopath/2007/PartnerControls">
   <documentManagement/>
@@ -3606,6 +3603,14 @@
 </file>
 
 <file path=customXml/itemProps1.xml><?xml version="1.0" encoding="utf-8"?>
+<ds:datastoreItem xmlns:ds="http://schemas.openxmlformats.org/officeDocument/2006/customXml" ds:itemID="{8596C67B-B43B-41C8-9F88-5A5B80DCA9A6}">
+  <ds:schemaRefs>
+    <ds:schemaRef ds:uri="http://schemas.microsoft.com/sharepoint/v3/contenttype/forms"/>
+  </ds:schemaRefs>
+</ds:datastoreItem>
+</file>
+
+<file path=customXml/itemProps2.xml><?xml version="1.0" encoding="utf-8"?>
 <ds:datastoreItem xmlns:ds="http://schemas.openxmlformats.org/officeDocument/2006/customXml" ds:itemID="{B6E13352-6108-4CAA-B972-173ED0B6D9AB}">
   <ds:schemaRefs>
     <ds:schemaRef ds:uri="http://schemas.microsoft.com/office/2006/metadata/contentType"/>
@@ -3623,14 +3628,6 @@
 </ds:datastoreItem>
 </file>
 
-<file path=customXml/itemProps2.xml><?xml version="1.0" encoding="utf-8"?>
-<ds:datastoreItem xmlns:ds="http://schemas.openxmlformats.org/officeDocument/2006/customXml" ds:itemID="{8596C67B-B43B-41C8-9F88-5A5B80DCA9A6}">
-  <ds:schemaRefs>
-    <ds:schemaRef ds:uri="http://schemas.microsoft.com/sharepoint/v3/contenttype/forms"/>
-  </ds:schemaRefs>
-</ds:datastoreItem>
-</file>
-
 <file path=customXml/itemProps3.xml><?xml version="1.0" encoding="utf-8"?>
 <ds:datastoreItem xmlns:ds="http://schemas.openxmlformats.org/officeDocument/2006/customXml" ds:itemID="{3593D940-8617-4C04-B0A2-E3229F602B36}">
   <ds:schemaRefs>

</xml_diff>